<commit_message>
Add answers for chapters in second source PDF
Co-authored-by: arena-agent <297053741+arena-agent@users.noreply.github.com>
</commit_message>
<xml_diff>
--- a/10.नियम इग्नोर न कर गोपाला Document.docx
+++ b/10.नियम इग्नोर न कर गोपाला Document.docx
@@ -124,123 +124,49 @@
     </w:p>
     <w:p>
       <w:pPr>
-        <w:jc w:val="center"/>
-        <w:rPr>
-          <w:rFonts w:cs="Mangal"/>
-          <w:b/>
-          <w:bCs/>
-          <w:szCs w:val="24"/>
-        </w:rPr>
-      </w:pPr>
+        <w:spacing w:after="0"/>
+        <w:jc w:val="both"/>
+      </w:pPr>
+      <w:r>
+        <w:rPr>
+          <w:rFonts w:ascii="Mangal" w:hAnsi="Mangal" w:cs="Mangal" w:eastAsia="Mangal"/>
+          <w:b/>
+          <w:sz w:val="24"/>
+        </w:rPr>
+        <w:t>शीर्षक पाठ की व्यंग्यात्मकता को संक्षेप में स्पष्ट कीजिए</w:t>
+      </w:r>
     </w:p>
     <w:p>
       <w:pPr>
-        <w:rPr>
-          <w:rFonts w:ascii="Arial" w:hAnsi="Arial" w:cs="Mangal"/>
-          <w:b/>
-          <w:bCs/>
-        </w:rPr>
-      </w:pPr>
-      <w:r>
-        <w:rPr>
-          <w:rFonts w:ascii="Arial" w:hAnsi="Arial" w:cs="Arial" w:hint="cs"/>
-          <w:b/>
-          <w:bCs/>
-          <w:szCs w:val="24"/>
-          <w:cs/>
-        </w:rPr>
-        <w:t>“</w:t>
-      </w:r>
-      <w:proofErr w:type="spellStart"/>
-      <w:r>
-        <w:rPr>
-          <w:rFonts w:cs="Mangal" w:hint="cs"/>
-          <w:b/>
-          <w:bCs/>
-          <w:szCs w:val="24"/>
-          <w:cs/>
-        </w:rPr>
-        <w:t>रिश्वतशास्त्र</w:t>
-      </w:r>
-      <w:proofErr w:type="spellEnd"/>
-      <w:r>
-        <w:rPr>
-          <w:rFonts w:cs="Mangal" w:hint="cs"/>
-          <w:b/>
-          <w:bCs/>
-          <w:szCs w:val="24"/>
-          <w:cs/>
-        </w:rPr>
-        <w:t xml:space="preserve"> में कम पगार में घर की आर्थिक मजबूती के लिए रिश्वत सबसे बेहतर एक्सरसाइज मानी गई है </w:t>
-      </w:r>
-      <w:r>
-        <w:rPr>
-          <w:rFonts w:cs="Mangal" w:hint="cs"/>
-          <w:b/>
-          <w:bCs/>
-          <w:szCs w:val="24"/>
-          <w:cs/>
-        </w:rPr>
-        <w:t xml:space="preserve">ऑफिस के बदले कहीं बाहर रिश्वत लेने के बहुत फायदे होते हैं इससे  घर की </w:t>
-      </w:r>
-      <w:proofErr w:type="spellStart"/>
-      <w:r>
-        <w:rPr>
-          <w:rFonts w:cs="Mangal" w:hint="cs"/>
-          <w:b/>
-          <w:bCs/>
-          <w:szCs w:val="24"/>
-          <w:cs/>
-        </w:rPr>
-        <w:t>स्टैण्डर्ड</w:t>
-      </w:r>
-      <w:proofErr w:type="spellEnd"/>
-      <w:r>
-        <w:rPr>
-          <w:rFonts w:cs="Mangal" w:hint="cs"/>
-          <w:b/>
-          <w:bCs/>
-          <w:szCs w:val="24"/>
-          <w:cs/>
-        </w:rPr>
-        <w:t xml:space="preserve"> प्रतिरोधक क्षमता बढ़ती हैं पर रिश्वत लेते हुए पकड़ें जाने के खतरे भी कम नहीं होते वैसे मास्क लगाकर रिश्वत लेना सबसे फायदेमंद रहता है इसके एक साथ कई-कई लाभ मिलते हैं </w:t>
-      </w:r>
-      <w:r>
-        <w:rPr>
-          <w:rFonts w:ascii="Arial" w:hAnsi="Arial" w:cs="Arial" w:hint="cs"/>
-          <w:b/>
-          <w:bCs/>
-          <w:szCs w:val="24"/>
-          <w:cs/>
-        </w:rPr>
-        <w:t>”</w:t>
-      </w:r>
-      <w:r>
-        <w:rPr>
-          <w:rFonts w:ascii="Arial" w:hAnsi="Arial" w:cs="Arial" w:hint="cs"/>
-          <w:b/>
-          <w:bCs/>
-          <w:szCs w:val="24"/>
-          <w:cs/>
-        </w:rPr>
-        <w:t>(</w:t>
-      </w:r>
-      <w:r>
-        <w:rPr>
-          <w:rFonts w:ascii="Arial" w:hAnsi="Arial" w:cs="Mangal" w:hint="cs"/>
-          <w:b/>
-          <w:bCs/>
-          <w:cs/>
-        </w:rPr>
-        <w:t>पृ.क्र.४२)</w:t>
+        <w:spacing w:after="0"/>
+        <w:jc w:val="both"/>
+      </w:pPr>
+      <w:r>
+        <w:rPr>
+          <w:rFonts w:ascii="Mangal" w:hAnsi="Mangal" w:cs="Mangal" w:eastAsia="Mangal"/>
+          <w:b w:val="0"/>
+          <w:sz w:val="24"/>
+        </w:rPr>
+        <w:t>लेखक रिश्वत लेने की आदत को व्यायाम, प्रतिरोधक क्षमता और नियमों वाला शास्त्र बताकर भ्रष्टाचार के सामान्यीकरण पर व्यंग्य करते हैं। रिश्वत लेने के “सही” तरीके, पकड़े जाने का जोखिम और मास्क के लाभ गिनाना अपराध को घरेलू वित्त-सुधार की सलाह की तरह पेश करता है। इस उलटबाँसी से लेखक भ्रष्टाचार की व्यापकता और उस पर समाज की ढिठाई उजागर करते हैं; संकेत ईमानदार, जवाबदेह व्यवस्था की ओर है।</w:t>
       </w:r>
     </w:p>
     <w:p>
       <w:pPr>
+        <w:jc w:val="center"/>
         <w:rPr>
           <w:rFonts w:cs="Mangal"/>
           <w:b/>
           <w:bCs/>
+          <w:szCs w:val="24"/>
+        </w:rPr>
+      </w:pPr>
+    </w:p>
+    <w:p>
+      <w:pPr>
+        <w:rPr>
+          <w:rFonts w:ascii="Arial" w:hAnsi="Arial" w:cs="Mangal"/>
+          <w:b/>
+          <w:bCs/>
         </w:rPr>
       </w:pPr>
       <w:r>
@@ -248,10 +174,85 @@
           <w:rFonts w:ascii="Arial" w:hAnsi="Arial" w:cs="Arial" w:hint="cs"/>
           <w:b/>
           <w:bCs/>
+          <w:szCs w:val="24"/>
           <w:cs/>
         </w:rPr>
         <w:t>“</w:t>
       </w:r>
+      <w:proofErr w:type="spellStart"/>
+      <w:r>
+        <w:rPr>
+          <w:rFonts w:cs="Mangal" w:hint="cs"/>
+          <w:b/>
+          <w:bCs/>
+          <w:szCs w:val="24"/>
+          <w:cs/>
+        </w:rPr>
+        <w:t>रिश्वतशास्त्र</w:t>
+      </w:r>
+      <w:proofErr w:type="spellEnd"/>
+      <w:r>
+        <w:rPr>
+          <w:rFonts w:cs="Mangal" w:hint="cs"/>
+          <w:b/>
+          <w:bCs/>
+          <w:szCs w:val="24"/>
+          <w:cs/>
+        </w:rPr>
+        <w:t xml:space="preserve"> में कम पगार में घर की आर्थिक मजबूती के लिए रिश्वत सबसे बेहतर एक्सरसाइज मानी गई है </w:t>
+      </w:r>
+      <w:r>
+        <w:rPr>
+          <w:rFonts w:cs="Mangal" w:hint="cs"/>
+          <w:b/>
+          <w:bCs/>
+          <w:szCs w:val="24"/>
+          <w:cs/>
+        </w:rPr>
+        <w:t xml:space="preserve">ऑफिस के बदले कहीं बाहर रिश्वत लेने के बहुत फायदे होते हैं इससे  घर की </w:t>
+      </w:r>
+      <w:proofErr w:type="spellStart"/>
+      <w:r>
+        <w:rPr>
+          <w:rFonts w:cs="Mangal" w:hint="cs"/>
+          <w:b/>
+          <w:bCs/>
+          <w:szCs w:val="24"/>
+          <w:cs/>
+        </w:rPr>
+        <w:t>स्टैण्डर्ड</w:t>
+      </w:r>
+      <w:proofErr w:type="spellEnd"/>
+      <w:r>
+        <w:rPr>
+          <w:rFonts w:cs="Mangal" w:hint="cs"/>
+          <w:b/>
+          <w:bCs/>
+          <w:szCs w:val="24"/>
+          <w:cs/>
+        </w:rPr>
+        <w:t xml:space="preserve"> प्रतिरोधक क्षमता बढ़ती हैं पर रिश्वत लेते हुए पकड़ें जाने के खतरे भी कम नहीं होते वैसे मास्क लगाकर रिश्वत लेना सबसे फायदेमंद रहता है इसके एक साथ कई-कई लाभ मिलते हैं </w:t>
+      </w:r>
+      <w:r>
+        <w:rPr>
+          <w:rFonts w:ascii="Arial" w:hAnsi="Arial" w:cs="Arial" w:hint="cs"/>
+          <w:b/>
+          <w:bCs/>
+          <w:szCs w:val="24"/>
+          <w:cs/>
+        </w:rPr>
+        <w:t>”</w:t>
+      </w:r>
+      <w:r>
+        <w:rPr>
+          <w:rFonts w:ascii="Arial" w:hAnsi="Arial" w:cs="Arial" w:hint="cs"/>
+          <w:b/>
+          <w:bCs/>
+          <w:szCs w:val="24"/>
+          <w:cs/>
+        </w:rPr>
+        <w:t>(</w:t>
+      </w:r>
       <w:r>
         <w:rPr>
           <w:rFonts w:ascii="Arial" w:hAnsi="Arial" w:cs="Mangal" w:hint="cs"/>
@@ -259,6 +260,117 @@
           <w:bCs/>
           <w:cs/>
         </w:rPr>
+        <w:t>पृ.क्र.४२)</w:t>
+      </w:r>
+    </w:p>
+    <w:p>
+      <w:pPr>
+        <w:spacing w:after="0"/>
+        <w:jc w:val="both"/>
+      </w:pPr>
+      <w:r>
+        <w:rPr>
+          <w:rFonts w:ascii="Mangal" w:hAnsi="Mangal" w:cs="Mangal" w:eastAsia="Mangal"/>
+          <w:b/>
+          <w:sz w:val="24"/>
+        </w:rPr>
+        <w:t>पंक्तियों की व्यंग्यात्मकता को विस्तृत रूप में स्पष्ट कीजिए</w:t>
+      </w:r>
+    </w:p>
+    <w:p>
+      <w:pPr>
+        <w:spacing w:after="0"/>
+        <w:jc w:val="both"/>
+      </w:pPr>
+      <w:r>
+        <w:rPr>
+          <w:rFonts w:ascii="Mangal" w:hAnsi="Mangal" w:cs="Mangal" w:eastAsia="Mangal"/>
+          <w:b w:val="0"/>
+          <w:sz w:val="24"/>
+        </w:rPr>
+        <w:t>रिश्वत को कम वेतन में घर की आर्थिक मजबूती के लिए “एक्सरसाइज” कहना भ्रष्टाचार को स्वास्थ्य और घरेलू लाभ की भाषा में ढक देता है। बाहर रिश्वत लेने, मानक प्रतिरोधक क्षमता बढ़ाने और मास्क के फायदे गिनाने की व्यावहारिक सूची अपराध को सामान्य सलाह बना देती है; पकड़े जाने का उल्लेख उस हास्य में छिपे वास्तविक जोखिम को भी दिखाता है।</w:t>
+      </w:r>
+    </w:p>
+    <w:p>
+      <w:pPr>
+        <w:spacing w:after="0"/>
+        <w:jc w:val="both"/>
+      </w:pPr>
+      <w:r>
+        <w:rPr>
+          <w:rFonts w:ascii="Mangal" w:hAnsi="Mangal" w:cs="Mangal" w:eastAsia="Mangal"/>
+          <w:b/>
+          <w:sz w:val="24"/>
+        </w:rPr>
+        <w:t>इसमें मुख्य व्यंग्य कौन-सा है?</w:t>
+      </w:r>
+    </w:p>
+    <w:p>
+      <w:pPr>
+        <w:spacing w:after="0"/>
+        <w:jc w:val="both"/>
+      </w:pPr>
+      <w:r>
+        <w:rPr>
+          <w:rFonts w:ascii="Mangal" w:hAnsi="Mangal" w:cs="Mangal" w:eastAsia="Mangal"/>
+          <w:b w:val="0"/>
+          <w:sz w:val="24"/>
+        </w:rPr>
+        <w:t>मुख्य व्यंग्य रिश्वत को आजीविका-सुधार का वैध उपाय मानने और भ्रष्टाचार के लिए “नियम” बनाने पर है। मास्क यहाँ स्वास्थ्य-सुरक्षा के बजाय पहचान छिपाने का औजार बन जाता है।</w:t>
+      </w:r>
+    </w:p>
+    <w:p>
+      <w:pPr>
+        <w:spacing w:after="0"/>
+        <w:jc w:val="both"/>
+      </w:pPr>
+      <w:r>
+        <w:rPr>
+          <w:rFonts w:ascii="Mangal" w:hAnsi="Mangal" w:cs="Mangal" w:eastAsia="Mangal"/>
+          <w:b/>
+          <w:sz w:val="24"/>
+        </w:rPr>
+        <w:t>लेखक क्या परिवर्तन चाहते हैं?</w:t>
+      </w:r>
+    </w:p>
+    <w:p>
+      <w:pPr>
+        <w:spacing w:after="0"/>
+        <w:jc w:val="both"/>
+      </w:pPr>
+      <w:r>
+        <w:rPr>
+          <w:rFonts w:ascii="Mangal" w:hAnsi="Mangal" w:cs="Mangal" w:eastAsia="Mangal"/>
+          <w:b w:val="0"/>
+          <w:sz w:val="24"/>
+        </w:rPr>
+        <w:t>लेखक चाहते हैं कि वेतन और प्रशासनिक व्यवस्था ऐसी हो कि रिश्वत को पूरक आय न माना जाए। भ्रष्टाचार पर प्रभावी निगरानी और दंड हो तथा सार्वजनिक सेवा ईमानदारी से चले।</w:t>
+      </w:r>
+    </w:p>
+    <w:p>
+      <w:pPr>
+        <w:rPr>
+          <w:rFonts w:cs="Mangal"/>
+          <w:b/>
+          <w:bCs/>
+        </w:rPr>
+      </w:pPr>
+      <w:r>
+        <w:rPr>
+          <w:rFonts w:ascii="Arial" w:hAnsi="Arial" w:cs="Arial" w:hint="cs"/>
+          <w:b/>
+          <w:bCs/>
+          <w:cs/>
+        </w:rPr>
+        <w:t>“</w:t>
+      </w:r>
+      <w:r>
+        <w:rPr>
+          <w:rFonts w:ascii="Arial" w:hAnsi="Arial" w:cs="Mangal" w:hint="cs"/>
+          <w:b/>
+          <w:bCs/>
+          <w:cs/>
+        </w:rPr>
         <w:t xml:space="preserve">मित्र !भले ही आज की तारीख में रिश्वत लेना घर की हालत सुधारने के लिए सब से अच्छी </w:t>
       </w:r>
       <w:r>
@@ -393,6 +505,90 @@
           <w:cs/>
         </w:rPr>
         <w:t>पृ.क्र.४३)</w:t>
+      </w:r>
+    </w:p>
+    <w:p>
+      <w:pPr>
+        <w:spacing w:after="0"/>
+        <w:jc w:val="both"/>
+      </w:pPr>
+      <w:r>
+        <w:rPr>
+          <w:rFonts w:ascii="Mangal" w:hAnsi="Mangal" w:cs="Mangal" w:eastAsia="Mangal"/>
+          <w:b/>
+          <w:sz w:val="24"/>
+        </w:rPr>
+        <w:t>पंक्तियों की व्यंग्यात्मकता को विस्तृत रूप में स्पष्ट कीजिए</w:t>
+      </w:r>
+    </w:p>
+    <w:p>
+      <w:pPr>
+        <w:spacing w:after="0"/>
+        <w:jc w:val="both"/>
+      </w:pPr>
+      <w:r>
+        <w:rPr>
+          <w:rFonts w:ascii="Mangal" w:hAnsi="Mangal" w:cs="Mangal" w:eastAsia="Mangal"/>
+          <w:b w:val="0"/>
+          <w:sz w:val="24"/>
+        </w:rPr>
+        <w:t>“सज्जनों तक” में रिश्वत का क्रेज बढ़ने और उसे खाने के नियमों की बात, नैतिक शब्दावली को उलट देती है। लेखक रिश्वतखोरी को एक व्यवस्थित विद्या जैसा बनाते हैं—सावधानी न हो तो व्यक्ति पकड़ा जाएगा—जिससे कानून-पालन नहीं, पकड़े जाने से बचना चिंता का विषय बनता है।</w:t>
+      </w:r>
+    </w:p>
+    <w:p>
+      <w:pPr>
+        <w:spacing w:after="0"/>
+        <w:jc w:val="both"/>
+      </w:pPr>
+      <w:r>
+        <w:rPr>
+          <w:rFonts w:ascii="Mangal" w:hAnsi="Mangal" w:cs="Mangal" w:eastAsia="Mangal"/>
+          <w:b/>
+          <w:sz w:val="24"/>
+        </w:rPr>
+        <w:t>इसमें मुख्य व्यंग्य कौन-सा है?</w:t>
+      </w:r>
+    </w:p>
+    <w:p>
+      <w:pPr>
+        <w:spacing w:after="0"/>
+        <w:jc w:val="both"/>
+      </w:pPr>
+      <w:r>
+        <w:rPr>
+          <w:rFonts w:ascii="Mangal" w:hAnsi="Mangal" w:cs="Mangal" w:eastAsia="Mangal"/>
+          <w:b w:val="0"/>
+          <w:sz w:val="24"/>
+        </w:rPr>
+        <w:t>मुख्य व्यंग्य रिश्वत लेने वालों की उस मानसिकता पर है जो गलत काम छोड़ने के बजाय उसे सुरक्षित ढंग से करने की तरकीब खोजती है। “नियम” की भाषा अपराध को सामान्य सामाजिक व्यवहार बना देती है।</w:t>
+      </w:r>
+    </w:p>
+    <w:p>
+      <w:pPr>
+        <w:spacing w:after="0"/>
+        <w:jc w:val="both"/>
+      </w:pPr>
+      <w:r>
+        <w:rPr>
+          <w:rFonts w:ascii="Mangal" w:hAnsi="Mangal" w:cs="Mangal" w:eastAsia="Mangal"/>
+          <w:b/>
+          <w:sz w:val="24"/>
+        </w:rPr>
+        <w:t>लेखक क्या परिवर्तन चाहते हैं?</w:t>
+      </w:r>
+    </w:p>
+    <w:p>
+      <w:pPr>
+        <w:spacing w:after="0"/>
+        <w:jc w:val="both"/>
+      </w:pPr>
+      <w:r>
+        <w:rPr>
+          <w:rFonts w:ascii="Mangal" w:hAnsi="Mangal" w:cs="Mangal" w:eastAsia="Mangal"/>
+          <w:b w:val="0"/>
+          <w:sz w:val="24"/>
+        </w:rPr>
+        <w:t>लेखक संकेत करते हैं कि बदलाव केवल रिश्वत लेने की सावधानियाँ सिखाने से नहीं, भ्रष्टाचार की जड़ें रोकने से आएगा। संस्थागत जवाबदेही, पारदर्शिता और ईमानदारी को प्राथमिकता मिलनी चाहिए।</w:t>
       </w:r>
     </w:p>
     <w:sectPr>

</xml_diff>